<commit_message>
Codici affiliazione ASI e Libertas
</commit_message>
<xml_diff>
--- a/public/templates/contratto_collaborazione.docx
+++ b/public/templates/contratto_collaborazione.docx
@@ -33,7 +33,7 @@
             <wp:positionV relativeFrom="paragraph">
               <wp:posOffset>-554355</wp:posOffset>
             </wp:positionV>
-            <wp:extent cx="2300000" cy="1533525"/>
+            <wp:extent cx="2300000" cy="1673525"/>
             <wp:effectExtent l="0" t="0" r="9525" b="9525"/>
             <wp:wrapNone/>
             <wp:docPr id="222014155" name="Immagine 1"/>
@@ -65,7 +65,7 @@
                   <pic:spPr bwMode="auto">
                     <a:xfrm>
                       <a:off x="0" y="0"/>
-                      <a:ext cx="2300000" cy="1533525"/>
+                      <a:ext cx="2300000" cy="1673525"/>
                     </a:xfrm>
                     <a:prstGeom prst="rect">
                       <a:avLst/>
@@ -174,7 +174,29 @@
           <w:sz w:val="16"/>
           <w:szCs w:val="16"/>
         </w:rPr>
-        <w:t>Codice affiliazione CONI 02500493</w:t>
+        <w:t>Codice affiliazione ASI BS0905</w:t>
+      </w:r>
+    </w:p>
+    <w:p>
+      <w:pPr>
+        <w:spacing w:after="0"/>
+        <w:ind w:left="3259" w:right="2877"/>
+        <w:jc w:val="center"/>
+        <w:rPr>
+          <w:b/>
+          <w:bCs/>
+          <w:sz w:val="16"/>
+          <w:szCs w:val="16"/>
+        </w:rPr>
+      </w:pPr>
+      <w:r>
+        <w:rPr>
+          <w:b/>
+          <w:bCs/>
+          <w:sz w:val="16"/>
+          <w:szCs w:val="16"/>
+        </w:rPr>
+        <w:t>Codice affiliazione Libertas BS481</w:t>
       </w:r>
     </w:p>
     <w:p>
@@ -783,7 +805,7 @@
           <w:sz w:val="20"/>
           <w:szCs w:val="20"/>
         </w:rPr>
-        <w:t>CNS Libertas, CSI.</w:t>
+        <w:t>CNS Libertas, ASI.</w:t>
       </w:r>
     </w:p>
     <w:p>
@@ -1024,7 +1046,7 @@
           <w:sz w:val="20"/>
           <w:szCs w:val="20"/>
         </w:rPr>
-        <w:t>CSI</w:t>
+        <w:t>ASI</w:t>
       </w:r>
       <w:r>
         <w:rPr>
@@ -1281,7 +1303,7 @@
           <w:sz w:val="20"/>
           <w:szCs w:val="20"/>
         </w:rPr>
-        <w:t>CNS Libertas, CSI</w:t>
+        <w:t>CNS Libertas, ASI</w:t>
       </w:r>
       <w:r>
         <w:rPr>
@@ -1672,7 +1694,7 @@
           <w:sz w:val="20"/>
           <w:szCs w:val="20"/>
         </w:rPr>
-        <w:t>CNS Libertas, CSI</w:t>
+        <w:t>CNS Libertas, ASI</w:t>
       </w:r>
       <w:r>
         <w:rPr>
@@ -2478,7 +2500,7 @@
           <w:sz w:val="20"/>
           <w:szCs w:val="20"/>
         </w:rPr>
-        <w:t>CNS Libertas, CSI.</w:t>
+        <w:t>CNS Libertas, ASI.</w:t>
       </w:r>
     </w:p>
     <w:p>

</xml_diff>